<commit_message>
Actually fix the letterhead logo overflow — scale, not just reposition
Previous commit only repositioned the logo, which didn't work because
the root cause was size, not position: the logo's own bounding box
(895350 EMU tall) was taller than the purple band itself (752475 EMU) —
no repositioning could ever fully contain it. Scaled it to 90% of the
band's height (preserving aspect ratio) and centered it vertically.
Verified against a real rendered PDF this time.

Co-Authored-By: Claude Sonnet 5 <noreply@anthropic.com>
Claude-Session: https://claude.ai/code/session_01MBTqSfHDu4d3GJUnULJX2P
</commit_message>
<xml_diff>
--- a/backend/app/static/templates/docx/internship_letter.docx
+++ b/backend/app/static/templates/docx/internship_letter.docx
@@ -732,9 +732,9 @@
             <wp:posOffset>-638175</wp:posOffset>
           </wp:positionH>
           <wp:positionV relativeFrom="paragraph">
-            <wp:posOffset>-835165</wp:posOffset>
+            <wp:posOffset>-419576</wp:posOffset>
           </wp:positionV>
-          <wp:extent cx="1619250" cy="895350"/>
+          <wp:extent cx="1224772" cy="677227"/>
           <wp:effectExtent l="0" t="0" r="0" b="0"/>
           <wp:wrapSquare wrapText="bothSides" distT="0" distB="0" distL="114300" distR="114300"/>
           <wp:docPr id="1728109672" name="image1.png"/>
@@ -762,7 +762,7 @@
                 <pic:spPr bwMode="auto">
                   <a:xfrm>
                     <a:off x="0" y="0"/>
-                    <a:ext cx="1619250" cy="895350"/>
+                    <a:ext cx="1224772" cy="677227"/>
                   </a:xfrm>
                   <a:prstGeom prst="rect">
                     <a:avLst/>

</xml_diff>